<commit_message>
Update question definitions and finalize enrollment/weekly UX
</commit_message>
<xml_diff>
--- a/archive/notes.docx
+++ b/archive/notes.docx
@@ -26,8 +26,14 @@
           <w:ilvl w:val="0"/>
           <w:numId w:val="4"/>
         </w:numPr>
-      </w:pPr>
-      <w:r>
+        <w:rPr>
+          <w:highlight w:val="yellow"/>
+        </w:rPr>
+      </w:pPr>
+      <w:r>
+        <w:rPr>
+          <w:highlight w:val="yellow"/>
+        </w:rPr>
         <w:t>2 Provider</w:t>
       </w:r>
     </w:p>
@@ -38,11 +44,20 @@
           <w:ilvl w:val="1"/>
           <w:numId w:val="4"/>
         </w:numPr>
-      </w:pPr>
-      <w:r>
+        <w:rPr>
+          <w:highlight w:val="yellow"/>
+        </w:rPr>
+      </w:pPr>
+      <w:r>
+        <w:rPr>
+          <w:highlight w:val="yellow"/>
+        </w:rPr>
         <w:t xml:space="preserve">Have the first caregiver in the providers tab be pre-loaded as myself in </w:t>
       </w:r>
       <w:r>
+        <w:rPr>
+          <w:highlight w:val="yellow"/>
+        </w:rPr>
         <w:t>a neutral grey color</w:t>
       </w:r>
     </w:p>
@@ -53,8 +68,14 @@
           <w:ilvl w:val="0"/>
           <w:numId w:val="4"/>
         </w:numPr>
-      </w:pPr>
-      <w:r>
+        <w:rPr>
+          <w:strike/>
+        </w:rPr>
+      </w:pPr>
+      <w:r>
+        <w:rPr>
+          <w:strike/>
+        </w:rPr>
         <w:t>3 affordability</w:t>
       </w:r>
     </w:p>
@@ -65,9 +86,29 @@
           <w:ilvl w:val="1"/>
           <w:numId w:val="4"/>
         </w:numPr>
-      </w:pPr>
-      <w:r>
-        <w:t>Have them put the percentage open. Include instruction: if you don’t know exactly, you can put an approximation</w:t>
+        <w:rPr>
+          <w:strike/>
+        </w:rPr>
+      </w:pPr>
+      <w:r>
+        <w:rPr>
+          <w:strike/>
+        </w:rPr>
+        <w:t xml:space="preserve">Have </w:t>
+      </w:r>
+      <w:proofErr w:type="gramStart"/>
+      <w:r>
+        <w:rPr>
+          <w:strike/>
+        </w:rPr>
+        <w:t>them</w:t>
+      </w:r>
+      <w:proofErr w:type="gramEnd"/>
+      <w:r>
+        <w:rPr>
+          <w:strike/>
+        </w:rPr>
+        <w:t xml:space="preserve"> put the percentage open. Include instruction: if you don’t know exactly, you can put an approximation</w:t>
       </w:r>
     </w:p>
     <w:p>
@@ -79,8 +120,13 @@
         </w:numPr>
       </w:pPr>
       <w:r>
-        <w:t>4 effort</w:t>
-      </w:r>
+        <w:t xml:space="preserve">4 </w:t>
+      </w:r>
+      <w:proofErr w:type="gramStart"/>
+      <w:r>
+        <w:t>effort</w:t>
+      </w:r>
+      <w:proofErr w:type="gramEnd"/>
     </w:p>
     <w:p>
       <w:pPr>
@@ -89,8 +135,14 @@
           <w:ilvl w:val="1"/>
           <w:numId w:val="4"/>
         </w:numPr>
-      </w:pPr>
-      <w:r>
+        <w:rPr>
+          <w:strike/>
+        </w:rPr>
+      </w:pPr>
+      <w:r>
+        <w:rPr>
+          <w:strike/>
+        </w:rPr>
         <w:t>Have them put minutes openly instead of choosing</w:t>
       </w:r>
     </w:p>
@@ -101,12 +153,35 @@
           <w:ilvl w:val="1"/>
           <w:numId w:val="4"/>
         </w:numPr>
-      </w:pPr>
-      <w:r>
+        <w:rPr>
+          <w:strike/>
+        </w:rPr>
+      </w:pPr>
+      <w:r>
+        <w:rPr>
+          <w:strike/>
+        </w:rPr>
         <w:t xml:space="preserve">Last question “how difficult” </w:t>
       </w:r>
       <w:r>
-        <w:t>-&gt; do not have not applicable as 0</w:t>
+        <w:rPr>
+          <w:strike/>
+        </w:rPr>
+        <w:t xml:space="preserve">-&gt; do not </w:t>
+      </w:r>
+      <w:proofErr w:type="gramStart"/>
+      <w:r>
+        <w:rPr>
+          <w:strike/>
+        </w:rPr>
+        <w:t>have not</w:t>
+      </w:r>
+      <w:proofErr w:type="gramEnd"/>
+      <w:r>
+        <w:rPr>
+          <w:strike/>
+        </w:rPr>
+        <w:t xml:space="preserve"> applicable as 0</w:t>
       </w:r>
     </w:p>
     <w:p>
@@ -118,7 +193,15 @@
         </w:numPr>
       </w:pPr>
       <w:r>
-        <w:t>For every question, include a side-option as “Don’t’know/Not applicable”</w:t>
+        <w:t>For every question, include a side-option as “</w:t>
+      </w:r>
+      <w:proofErr w:type="spellStart"/>
+      <w:r>
+        <w:t>Don’t’know</w:t>
+      </w:r>
+      <w:proofErr w:type="spellEnd"/>
+      <w:r>
+        <w:t>/Not applicable”</w:t>
       </w:r>
     </w:p>
     <w:p>
@@ -145,8 +228,13 @@
         <w:t xml:space="preserve">Not allowing me to click </w:t>
       </w:r>
       <w:r>
-        <w:t>any of the multiple choice</w:t>
-      </w:r>
+        <w:t xml:space="preserve">any of the </w:t>
+      </w:r>
+      <w:proofErr w:type="gramStart"/>
+      <w:r>
+        <w:t>multiple choice</w:t>
+      </w:r>
+      <w:proofErr w:type="gramEnd"/>
       <w:r>
         <w:t xml:space="preserve"> question</w:t>
       </w:r>
@@ -164,9 +252,43 @@
           <w:ilvl w:val="0"/>
           <w:numId w:val="4"/>
         </w:numPr>
-      </w:pPr>
-      <w:r>
-        <w:t>11 review and submit:</w:t>
+        <w:rPr>
+          <w:highlight w:val="yellow"/>
+        </w:rPr>
+      </w:pPr>
+      <w:r>
+        <w:rPr>
+          <w:highlight w:val="yellow"/>
+        </w:rPr>
+        <w:t xml:space="preserve">11 </w:t>
+      </w:r>
+      <w:proofErr w:type="gramStart"/>
+      <w:r>
+        <w:rPr>
+          <w:highlight w:val="yellow"/>
+        </w:rPr>
+        <w:t>review</w:t>
+      </w:r>
+      <w:proofErr w:type="gramEnd"/>
+      <w:r>
+        <w:rPr>
+          <w:highlight w:val="yellow"/>
+        </w:rPr>
+        <w:t xml:space="preserve"> and </w:t>
+      </w:r>
+      <w:proofErr w:type="gramStart"/>
+      <w:r>
+        <w:rPr>
+          <w:highlight w:val="yellow"/>
+        </w:rPr>
+        <w:t>submit</w:t>
+      </w:r>
+      <w:proofErr w:type="gramEnd"/>
+      <w:r>
+        <w:rPr>
+          <w:highlight w:val="yellow"/>
+        </w:rPr>
+        <w:t>:</w:t>
       </w:r>
     </w:p>
     <w:p>
@@ -176,8 +298,14 @@
           <w:ilvl w:val="1"/>
           <w:numId w:val="4"/>
         </w:numPr>
-      </w:pPr>
-      <w:r>
+        <w:rPr>
+          <w:highlight w:val="yellow"/>
+        </w:rPr>
+      </w:pPr>
+      <w:r>
+        <w:rPr>
+          <w:highlight w:val="yellow"/>
+        </w:rPr>
         <w:t>Do not show summary like that, leave it open for now</w:t>
       </w:r>
     </w:p>
@@ -200,8 +328,14 @@
           <w:ilvl w:val="1"/>
           <w:numId w:val="4"/>
         </w:numPr>
-      </w:pPr>
-      <w:r>
+        <w:rPr>
+          <w:strike/>
+        </w:rPr>
+      </w:pPr>
+      <w:r>
+        <w:rPr>
+          <w:strike/>
+        </w:rPr>
         <w:t>Exclude new waitlist question</w:t>
       </w:r>
     </w:p>
@@ -212,17 +346,46 @@
           <w:ilvl w:val="1"/>
           <w:numId w:val="4"/>
         </w:numPr>
-      </w:pPr>
-      <w:r>
-        <w:t xml:space="preserve">For “removed from waitlist question”. Phrase it differently like “did you get off of any waitlists, as in, got a spot in a </w:t>
-      </w:r>
-      <w:r>
+        <w:rPr>
+          <w:strike/>
+        </w:rPr>
+      </w:pPr>
+      <w:r>
+        <w:rPr>
+          <w:strike/>
+        </w:rPr>
+        <w:t xml:space="preserve">For “removed from waitlist question”. Phrase it differently like “did you get </w:t>
+      </w:r>
+      <w:proofErr w:type="gramStart"/>
+      <w:r>
+        <w:rPr>
+          <w:strike/>
+        </w:rPr>
+        <w:t>off of</w:t>
+      </w:r>
+      <w:proofErr w:type="gramEnd"/>
+      <w:r>
+        <w:rPr>
+          <w:strike/>
+        </w:rPr>
+        <w:t xml:space="preserve"> any waitlists, as in, got a spot in a </w:t>
+      </w:r>
+      <w:r>
+        <w:rPr>
+          <w:strike/>
+        </w:rPr>
         <w:t xml:space="preserve">new childcare </w:t>
       </w:r>
       <w:r>
+        <w:rPr>
+          <w:strike/>
+        </w:rPr>
         <w:t>option where you were previously on a waitlist</w:t>
       </w:r>
       <w:r>
+        <w:rPr>
+          <w:strike/>
+        </w:rPr>
         <w:t>?</w:t>
       </w:r>
     </w:p>
@@ -233,17 +396,32 @@
           <w:ilvl w:val="2"/>
           <w:numId w:val="4"/>
         </w:numPr>
-      </w:pPr>
-      <w:r>
+        <w:rPr>
+          <w:strike/>
+        </w:rPr>
+      </w:pPr>
+      <w:r>
+        <w:rPr>
+          <w:strike/>
+        </w:rPr>
         <w:t xml:space="preserve">If yes, </w:t>
       </w:r>
       <w:r>
+        <w:rPr>
+          <w:strike/>
+        </w:rPr>
         <w:t xml:space="preserve">ask if any other potential “confounders” also changed and thus </w:t>
       </w:r>
       <w:r>
+        <w:rPr>
+          <w:strike/>
+        </w:rPr>
         <w:t>led to getting of the waitlist like “got a new job”, “got a raise”</w:t>
       </w:r>
       <w:r>
+        <w:rPr>
+          <w:strike/>
+        </w:rPr>
         <w:t>, “moved to a new home”, etc.</w:t>
       </w:r>
     </w:p>
@@ -254,8 +432,14 @@
           <w:ilvl w:val="1"/>
           <w:numId w:val="4"/>
         </w:numPr>
-      </w:pPr>
-      <w:r>
+        <w:rPr>
+          <w:highlight w:val="yellow"/>
+        </w:rPr>
+      </w:pPr>
+      <w:r>
+        <w:rPr>
+          <w:highlight w:val="yellow"/>
+        </w:rPr>
         <w:t>Do not display review or computed metrics to participant</w:t>
       </w:r>
     </w:p>
@@ -266,8 +450,14 @@
           <w:ilvl w:val="0"/>
           <w:numId w:val="4"/>
         </w:numPr>
-      </w:pPr>
-      <w:r>
+        <w:rPr>
+          <w:strike/>
+        </w:rPr>
+      </w:pPr>
+      <w:r>
+        <w:rPr>
+          <w:strike/>
+        </w:rPr>
         <w:t>Other edits:</w:t>
       </w:r>
     </w:p>
@@ -278,12 +468,29 @@
           <w:ilvl w:val="1"/>
           <w:numId w:val="4"/>
         </w:numPr>
-      </w:pPr>
-      <w:r>
-        <w:t xml:space="preserve">I edited the file structure, now there is not parent folder anymore, it is just the </w:t>
-      </w:r>
-      <w:r>
-        <w:t xml:space="preserve">childcare-precarity-tool folder. </w:t>
+        <w:rPr>
+          <w:strike/>
+        </w:rPr>
+      </w:pPr>
+      <w:r>
+        <w:rPr>
+          <w:strike/>
+        </w:rPr>
+        <w:t xml:space="preserve">I edited the file structure, now there is </w:t>
+      </w:r>
+      <w:proofErr w:type="gramStart"/>
+      <w:r>
+        <w:rPr>
+          <w:strike/>
+        </w:rPr>
+        <w:t>not</w:t>
+      </w:r>
+      <w:proofErr w:type="gramEnd"/>
+      <w:r>
+        <w:rPr>
+          <w:strike/>
+        </w:rPr>
+        <w:t xml:space="preserve"> parent folder anymore, it is just the childcare-precarity-tool folder. </w:t>
       </w:r>
     </w:p>
     <w:p>
@@ -293,11 +500,34 @@
           <w:ilvl w:val="1"/>
           <w:numId w:val="4"/>
         </w:numPr>
-      </w:pPr>
-      <w:r>
-        <w:t xml:space="preserve">I excluded some files and moved some to a folder called archive. Please have github ignore and not </w:t>
-      </w:r>
-      <w:r>
+        <w:rPr>
+          <w:strike/>
+        </w:rPr>
+      </w:pPr>
+      <w:r>
+        <w:rPr>
+          <w:strike/>
+        </w:rPr>
+        <w:t xml:space="preserve">I excluded some files and moved some to a folder called archive. Please have </w:t>
+      </w:r>
+      <w:proofErr w:type="spellStart"/>
+      <w:r>
+        <w:rPr>
+          <w:strike/>
+        </w:rPr>
+        <w:t>github</w:t>
+      </w:r>
+      <w:proofErr w:type="spellEnd"/>
+      <w:r>
+        <w:rPr>
+          <w:strike/>
+        </w:rPr>
+        <w:t xml:space="preserve"> ignore and not </w:t>
+      </w:r>
+      <w:r>
+        <w:rPr>
+          <w:strike/>
+        </w:rPr>
         <w:t>synchronize this folder, I want it locally only</w:t>
       </w:r>
     </w:p>
@@ -698,8 +928,13 @@
         <w:t xml:space="preserve">? </w:t>
       </w:r>
       <w:r>
-        <w:t>Provider has degree?</w:t>
-      </w:r>
+        <w:t xml:space="preserve">Provider has </w:t>
+      </w:r>
+      <w:proofErr w:type="gramStart"/>
+      <w:r>
+        <w:t>degree?</w:t>
+      </w:r>
+      <w:proofErr w:type="gramEnd"/>
     </w:p>
     <w:p>
       <w:pPr>
@@ -748,8 +983,13 @@
           <w:numId w:val="3"/>
         </w:numPr>
       </w:pPr>
-      <w:r>
-        <w:t>Meet parents’ needs</w:t>
+      <w:proofErr w:type="gramStart"/>
+      <w:r>
+        <w:t>Meet</w:t>
+      </w:r>
+      <w:proofErr w:type="gramEnd"/>
+      <w:r>
+        <w:t xml:space="preserve"> parents’ needs</w:t>
       </w:r>
     </w:p>
     <w:p>
@@ -1222,9 +1462,11 @@
           <w:tab w:val="left" w:pos="7898"/>
         </w:tabs>
       </w:pPr>
+      <w:proofErr w:type="spellStart"/>
       <w:r>
         <w:t>Etc</w:t>
       </w:r>
+      <w:proofErr w:type="spellEnd"/>
     </w:p>
     <w:p>
       <w:pPr>
@@ -1253,7 +1495,15 @@
         </w:tabs>
       </w:pPr>
       <w:r>
-        <w:t>Parents: precarity (instability + smth), work-status, stress, cognition?</w:t>
+        <w:t xml:space="preserve">Parents: precarity (instability + </w:t>
+      </w:r>
+      <w:proofErr w:type="spellStart"/>
+      <w:r>
+        <w:t>smth</w:t>
+      </w:r>
+      <w:proofErr w:type="spellEnd"/>
+      <w:r>
+        <w:t>), work-status, stress, cognition?</w:t>
       </w:r>
     </w:p>
     <w:p>
@@ -1302,7 +1552,15 @@
       </w:pPr>
       <w:r>
         <w:lastRenderedPageBreak/>
-        <w:t xml:space="preserve">Think about design carefully: how much time, when to measure, how long should the study be, etc. </w:t>
+        <w:t xml:space="preserve">Think about design carefully: how much time, when to measure, how long </w:t>
+      </w:r>
+      <w:proofErr w:type="gramStart"/>
+      <w:r>
+        <w:t>should the study</w:t>
+      </w:r>
+      <w:proofErr w:type="gramEnd"/>
+      <w:r>
+        <w:t xml:space="preserve"> be, etc. </w:t>
       </w:r>
     </w:p>
     <w:p>
@@ -1346,8 +1604,13 @@
         <w:t xml:space="preserve">Phil said to go community based, </w:t>
       </w:r>
       <w:r>
-        <w:t>make it useful, blablabla</w:t>
-      </w:r>
+        <w:t xml:space="preserve">make it useful, </w:t>
+      </w:r>
+      <w:proofErr w:type="spellStart"/>
+      <w:r>
+        <w:t>blablabla</w:t>
+      </w:r>
+      <w:proofErr w:type="spellEnd"/>
     </w:p>
     <w:p>
       <w:pPr>

</xml_diff>

<commit_message>
changed title and removes participant-facing summaries
</commit_message>
<xml_diff>
--- a/archive/notes.docx
+++ b/archive/notes.docx
@@ -26,8 +26,14 @@
           <w:ilvl w:val="0"/>
           <w:numId w:val="5"/>
         </w:numPr>
-      </w:pPr>
-      <w:r>
+        <w:rPr>
+          <w:strike/>
+        </w:rPr>
+      </w:pPr>
+      <w:r>
+        <w:rPr>
+          <w:strike/>
+        </w:rPr>
         <w:t>Have the first caregiver in the providers tab be pre-loaded as myself in a neutral grey color</w:t>
       </w:r>
     </w:p>
@@ -50,8 +56,14 @@
           <w:ilvl w:val="0"/>
           <w:numId w:val="5"/>
         </w:numPr>
-      </w:pPr>
-      <w:r>
+        <w:rPr>
+          <w:strike/>
+        </w:rPr>
+      </w:pPr>
+      <w:r>
+        <w:rPr>
+          <w:strike/>
+        </w:rPr>
         <w:t>Figure out entry vs weekly</w:t>
       </w:r>
     </w:p>
@@ -74,6 +86,35 @@
       <w:r>
         <w:t xml:space="preserve"> adaptation</w:t>
       </w:r>
+    </w:p>
+    <w:p>
+      <w:pPr>
+        <w:pStyle w:val="ListParagraph"/>
+        <w:numPr>
+          <w:ilvl w:val="0"/>
+          <w:numId w:val="5"/>
+        </w:numPr>
+      </w:pPr>
+      <w:r>
+        <w:t xml:space="preserve">Take out summaries in the end in all surveys, </w:t>
+      </w:r>
+      <w:proofErr w:type="spellStart"/>
+      <w:r>
+        <w:t>parcitipants</w:t>
+      </w:r>
+      <w:proofErr w:type="spellEnd"/>
+      <w:r>
+        <w:t xml:space="preserve"> should not view their summaries.</w:t>
+      </w:r>
+    </w:p>
+    <w:p>
+      <w:pPr>
+        <w:pStyle w:val="ListParagraph"/>
+        <w:numPr>
+          <w:ilvl w:val="0"/>
+          <w:numId w:val="5"/>
+        </w:numPr>
+      </w:pPr>
     </w:p>
     <w:p>
       <w:pPr>
@@ -589,6 +630,7 @@
         <w:rPr>
           <w:strike/>
         </w:rPr>
+        <w:lastRenderedPageBreak/>
         <w:t>Do not show summary like that, leave it open for now</w:t>
       </w:r>
     </w:p>
@@ -637,7 +679,6 @@
         <w:rPr>
           <w:strike/>
         </w:rPr>
-        <w:lastRenderedPageBreak/>
         <w:t xml:space="preserve">For “removed from waitlist question”. Phrase it differently like “did you get </w:t>
       </w:r>
       <w:proofErr w:type="gramStart"/>
@@ -1097,6 +1138,7 @@
         </w:numPr>
       </w:pPr>
       <w:r>
+        <w:lastRenderedPageBreak/>
         <w:t>Subsidy?</w:t>
       </w:r>
     </w:p>
@@ -1136,7 +1178,6 @@
         </w:numPr>
       </w:pPr>
       <w:r>
-        <w:lastRenderedPageBreak/>
         <w:t>geographical location + location of each provider</w:t>
       </w:r>
     </w:p>
@@ -1511,6 +1552,7 @@
         <w:rPr>
           <w:noProof/>
         </w:rPr>
+        <w:lastRenderedPageBreak/>
         <w:drawing>
           <wp:inline distT="0" distB="0" distL="0" distR="0" wp14:anchorId="6D8414E2" wp14:editId="68B1D156">
             <wp:extent cx="5614988" cy="2009638"/>
@@ -1925,6 +1967,7 @@
         </w:tabs>
       </w:pPr>
       <w:r>
+        <w:lastRenderedPageBreak/>
         <w:t>We ask them to plan at the beginning of each week, they can use to orient themselves, just like a regular calendar</w:t>
       </w:r>
     </w:p>
@@ -2072,7 +2115,6 @@
         </w:tabs>
       </w:pPr>
       <w:r>
-        <w:lastRenderedPageBreak/>
         <w:t xml:space="preserve">Eventually, if they are searching, we can even help them FIND IT. </w:t>
       </w:r>
     </w:p>

</xml_diff>

<commit_message>
removed emotional distress questions from entry and exit assessment, asked Codex to fix bugs and issues, changes some questions and placeholder questions
</commit_message>
<xml_diff>
--- a/archive/notes.docx
+++ b/archive/notes.docx
@@ -3,6 +3,170 @@
 <w:document xmlns:wpc="http://schemas.microsoft.com/office/word/2010/wordprocessingCanvas" xmlns:cx="http://schemas.microsoft.com/office/drawing/2014/chartex" xmlns:cx1="http://schemas.microsoft.com/office/drawing/2015/9/8/chartex" xmlns:cx2="http://schemas.microsoft.com/office/drawing/2015/10/21/chartex" xmlns:cx3="http://schemas.microsoft.com/office/drawing/2016/5/9/chartex" xmlns:cx4="http://schemas.microsoft.com/office/drawing/2016/5/10/chartex" xmlns:cx5="http://schemas.microsoft.com/office/drawing/2016/5/11/chartex" xmlns:cx6="http://schemas.microsoft.com/office/drawing/2016/5/12/chartex" xmlns:cx7="http://schemas.microsoft.com/office/drawing/2016/5/13/chartex" xmlns:cx8="http://schemas.microsoft.com/office/drawing/2016/5/14/chartex" xmlns:mc="http://schemas.openxmlformats.org/markup-compatibility/2006" xmlns:aink="http://schemas.microsoft.com/office/drawing/2016/ink" xmlns:am3d="http://schemas.microsoft.com/office/drawing/2017/model3d" xmlns:o="urn:schemas-microsoft-com:office:office" xmlns:oel="http://schemas.microsoft.com/office/2019/extlst" xmlns:r="http://schemas.openxmlformats.org/officeDocument/2006/relationships" xmlns:m="http://schemas.openxmlformats.org/officeDocument/2006/math" xmlns:v="urn:schemas-microsoft-com:vml" xmlns:wp14="http://schemas.microsoft.com/office/word/2010/wordprocessingDrawing" xmlns:wp="http://schemas.openxmlformats.org/drawingml/2006/wordprocessingDrawing" xmlns:w10="urn:schemas-microsoft-com:office:word" xmlns:w="http://schemas.openxmlformats.org/wordprocessingml/2006/main" xmlns:w14="http://schemas.microsoft.com/office/word/2010/wordml" xmlns:w15="http://schemas.microsoft.com/office/word/2012/wordml" xmlns:w16cex="http://schemas.microsoft.com/office/word/2018/wordml/cex" xmlns:w16cid="http://schemas.microsoft.com/office/word/2016/wordml/cid" xmlns:w16="http://schemas.microsoft.com/office/word/2018/wordml" xmlns:w16du="http://schemas.microsoft.com/office/word/2023/wordml/word16du" xmlns:w16sdtdh="http://schemas.microsoft.com/office/word/2020/wordml/sdtdatahash" xmlns:w16sdtfl="http://schemas.microsoft.com/office/word/2024/wordml/sdtformatlock" xmlns:w16se="http://schemas.microsoft.com/office/word/2015/wordml/symex" xmlns:wpg="http://schemas.microsoft.com/office/word/2010/wordprocessingGroup" xmlns:wpi="http://schemas.microsoft.com/office/word/2010/wordprocessingInk" xmlns:wne="http://schemas.microsoft.com/office/word/2006/wordml" xmlns:wps="http://schemas.microsoft.com/office/word/2010/wordprocessingShape" mc:Ignorable="w14 w15 w16se w16cid w16 w16cex w16sdtdh w16sdtfl w16du wp14">
   <w:body>
     <w:p>
+      <w:r>
+        <w:rPr>
+          <w:highlight w:val="yellow"/>
+        </w:rPr>
+        <w:t>Next to-do’s</w:t>
+      </w:r>
+    </w:p>
+    <w:p>
+      <w:pPr>
+        <w:pStyle w:val="ListParagraph"/>
+        <w:numPr>
+          <w:ilvl w:val="0"/>
+          <w:numId w:val="6"/>
+        </w:numPr>
+      </w:pPr>
+      <w:r>
+        <w:t>Make home page an eligibility questionnaire</w:t>
+      </w:r>
+    </w:p>
+    <w:p>
+      <w:pPr>
+        <w:pStyle w:val="ListParagraph"/>
+        <w:numPr>
+          <w:ilvl w:val="1"/>
+          <w:numId w:val="6"/>
+        </w:numPr>
+      </w:pPr>
+      <w:r>
+        <w:t>Do you have a child younger than 5?</w:t>
+      </w:r>
+    </w:p>
+    <w:p>
+      <w:pPr>
+        <w:pStyle w:val="ListParagraph"/>
+        <w:numPr>
+          <w:ilvl w:val="1"/>
+          <w:numId w:val="6"/>
+        </w:numPr>
+      </w:pPr>
+      <w:r>
+        <w:t>Are you currently on a waitlist to secure a spot at a childcare facility or provider?</w:t>
+      </w:r>
+    </w:p>
+    <w:p>
+      <w:pPr>
+        <w:pStyle w:val="ListParagraph"/>
+        <w:numPr>
+          <w:ilvl w:val="1"/>
+          <w:numId w:val="6"/>
+        </w:numPr>
+      </w:pPr>
+      <w:r>
+        <w:t xml:space="preserve">Are you over 18? </w:t>
+      </w:r>
+    </w:p>
+    <w:p>
+      <w:pPr>
+        <w:pStyle w:val="ListParagraph"/>
+        <w:numPr>
+          <w:ilvl w:val="1"/>
+          <w:numId w:val="6"/>
+        </w:numPr>
+      </w:pPr>
+      <w:r>
+        <w:t>Do you speak English?</w:t>
+      </w:r>
+    </w:p>
+    <w:p>
+      <w:pPr>
+        <w:pStyle w:val="ListParagraph"/>
+        <w:numPr>
+          <w:ilvl w:val="1"/>
+          <w:numId w:val="6"/>
+        </w:numPr>
+      </w:pPr>
+      <w:r>
+        <w:t>Email and phone number?</w:t>
+      </w:r>
+    </w:p>
+    <w:p>
+      <w:pPr>
+        <w:pStyle w:val="ListParagraph"/>
+        <w:numPr>
+          <w:ilvl w:val="2"/>
+          <w:numId w:val="6"/>
+        </w:numPr>
+      </w:pPr>
+      <w:r>
+        <w:t xml:space="preserve">Talk to claude to see what’s the most IRB-compliant way to do this eligibility screener, waiver of consent and etc. </w:t>
+      </w:r>
+    </w:p>
+    <w:p>
+      <w:pPr>
+        <w:pStyle w:val="ListParagraph"/>
+        <w:numPr>
+          <w:ilvl w:val="0"/>
+          <w:numId w:val="6"/>
+        </w:numPr>
+      </w:pPr>
+      <w:r>
+        <w:t>Parent cognition</w:t>
+      </w:r>
+    </w:p>
+    <w:p>
+      <w:pPr>
+        <w:pStyle w:val="ListParagraph"/>
+        <w:numPr>
+          <w:ilvl w:val="0"/>
+          <w:numId w:val="6"/>
+        </w:numPr>
+      </w:pPr>
+      <w:r>
+        <w:t>Child cognition</w:t>
+      </w:r>
+    </w:p>
+    <w:p>
+      <w:pPr>
+        <w:pStyle w:val="ListParagraph"/>
+        <w:numPr>
+          <w:ilvl w:val="0"/>
+          <w:numId w:val="6"/>
+        </w:numPr>
+      </w:pPr>
+      <w:r>
+        <w:t>Qualtrics adaptation</w:t>
+      </w:r>
+    </w:p>
+    <w:p>
+      <w:pPr>
+        <w:pStyle w:val="ListParagraph"/>
+        <w:numPr>
+          <w:ilvl w:val="0"/>
+          <w:numId w:val="6"/>
+        </w:numPr>
+      </w:pPr>
+      <w:r>
+        <w:t>Readme adaptation</w:t>
+      </w:r>
+    </w:p>
+    <w:p>
+      <w:pPr>
+        <w:pStyle w:val="ListParagraph"/>
+        <w:numPr>
+          <w:ilvl w:val="0"/>
+          <w:numId w:val="6"/>
+        </w:numPr>
+      </w:pPr>
+      <w:r>
+        <w:t>Firebase integration</w:t>
+      </w:r>
+    </w:p>
+    <w:p>
+      <w:pPr>
+        <w:pStyle w:val="ListParagraph"/>
+        <w:numPr>
+          <w:ilvl w:val="0"/>
+          <w:numId w:val="6"/>
+        </w:numPr>
+      </w:pPr>
+      <w:r>
+        <w:t>Start making IRB materials</w:t>
+      </w:r>
+    </w:p>
+    <w:p>
       <w:pPr>
         <w:rPr>
           <w:b/>
@@ -76,15 +240,7 @@
         </w:numPr>
       </w:pPr>
       <w:r>
-        <w:t xml:space="preserve">Figure out </w:t>
-      </w:r>
-      <w:proofErr w:type="spellStart"/>
-      <w:r>
-        <w:t>qualtrics</w:t>
-      </w:r>
-      <w:proofErr w:type="spellEnd"/>
-      <w:r>
-        <w:t xml:space="preserve"> adaptation</w:t>
+        <w:t>Figure out qualtrics adaptation</w:t>
       </w:r>
     </w:p>
     <w:p>
@@ -102,21 +258,7 @@
         <w:rPr>
           <w:strike/>
         </w:rPr>
-        <w:t xml:space="preserve">Take out summaries in the end in all surveys, </w:t>
-      </w:r>
-      <w:proofErr w:type="spellStart"/>
-      <w:r>
-        <w:rPr>
-          <w:strike/>
-        </w:rPr>
-        <w:t>parcitipants</w:t>
-      </w:r>
-      <w:proofErr w:type="spellEnd"/>
-      <w:r>
-        <w:rPr>
-          <w:strike/>
-        </w:rPr>
-        <w:t xml:space="preserve"> should not view their summaries.</w:t>
+        <w:t>Take out summaries in the end in all surveys, parcitipants should not view their summaries.</w:t>
       </w:r>
     </w:p>
     <w:p>
@@ -169,16 +311,8 @@
         <w:rPr>
           <w:strike/>
         </w:rPr>
-        <w:t xml:space="preserve">Change name to </w:t>
-      </w:r>
-      <w:proofErr w:type="spellStart"/>
-      <w:r>
-        <w:rPr>
-          <w:strike/>
-        </w:rPr>
-        <w:t>caremometer</w:t>
-      </w:r>
-      <w:proofErr w:type="spellEnd"/>
+        <w:t>Change name to caremometer</w:t>
+      </w:r>
     </w:p>
     <w:p>
       <w:pPr>
@@ -219,35 +353,7 @@
         <w:rPr>
           <w:strike/>
         </w:rPr>
-        <w:t xml:space="preserve">Including entry question about relationship </w:t>
-      </w:r>
-      <w:proofErr w:type="gramStart"/>
-      <w:r>
-        <w:rPr>
-          <w:strike/>
-        </w:rPr>
-        <w:t>to</w:t>
-      </w:r>
-      <w:proofErr w:type="gramEnd"/>
-      <w:r>
-        <w:rPr>
-          <w:strike/>
-        </w:rPr>
-        <w:t xml:space="preserve"> child (i.e., biological mother, </w:t>
-      </w:r>
-      <w:proofErr w:type="spellStart"/>
-      <w:r>
-        <w:rPr>
-          <w:strike/>
-        </w:rPr>
-        <w:t>etc</w:t>
-      </w:r>
-      <w:proofErr w:type="spellEnd"/>
-      <w:r>
-        <w:rPr>
-          <w:strike/>
-        </w:rPr>
-        <w:t>)</w:t>
+        <w:t>Including entry question about relationship to child (i.e., biological mother, etc)</w:t>
       </w:r>
     </w:p>
     <w:p>
@@ -289,15 +395,7 @@
         </w:numPr>
       </w:pPr>
       <w:r>
-        <w:t xml:space="preserve">Figure out </w:t>
-      </w:r>
-      <w:proofErr w:type="spellStart"/>
-      <w:r>
-        <w:t>qualtrics</w:t>
-      </w:r>
-      <w:proofErr w:type="spellEnd"/>
-      <w:r>
-        <w:t xml:space="preserve"> adaptation</w:t>
+        <w:t>Figure out qualtrics adaptation</w:t>
       </w:r>
     </w:p>
     <w:p>
@@ -315,6 +413,7 @@
         <w:rPr>
           <w:strike/>
         </w:rPr>
+        <w:lastRenderedPageBreak/>
         <w:t>Figure out mobile browser version</w:t>
       </w:r>
     </w:p>
@@ -329,19 +428,11 @@
           <w:strike/>
         </w:rPr>
       </w:pPr>
-      <w:proofErr w:type="gramStart"/>
-      <w:r>
-        <w:rPr>
-          <w:strike/>
-        </w:rPr>
-        <w:t>Check on</w:t>
-      </w:r>
-      <w:proofErr w:type="gramEnd"/>
-      <w:r>
-        <w:rPr>
-          <w:strike/>
-        </w:rPr>
-        <w:t xml:space="preserve"> the items below</w:t>
+      <w:r>
+        <w:rPr>
+          <w:strike/>
+        </w:rPr>
+        <w:t>Check on the items below</w:t>
       </w:r>
     </w:p>
     <w:p>
@@ -430,21 +521,7 @@
         <w:rPr>
           <w:strike/>
         </w:rPr>
-        <w:t xml:space="preserve">Have </w:t>
-      </w:r>
-      <w:proofErr w:type="gramStart"/>
-      <w:r>
-        <w:rPr>
-          <w:strike/>
-        </w:rPr>
-        <w:t>them</w:t>
-      </w:r>
-      <w:proofErr w:type="gramEnd"/>
-      <w:r>
-        <w:rPr>
-          <w:strike/>
-        </w:rPr>
-        <w:t xml:space="preserve"> put the percentage open. Include instruction: if you don’t know exactly, you can put an approximation</w:t>
+        <w:t>Have them put the percentage open. Include instruction: if you don’t know exactly, you can put an approximation</w:t>
       </w:r>
     </w:p>
     <w:p>
@@ -456,13 +533,8 @@
         </w:numPr>
       </w:pPr>
       <w:r>
-        <w:t xml:space="preserve">4 </w:t>
-      </w:r>
-      <w:proofErr w:type="gramStart"/>
-      <w:r>
-        <w:t>effort</w:t>
-      </w:r>
-      <w:proofErr w:type="gramEnd"/>
+        <w:t>4 effort</w:t>
+      </w:r>
     </w:p>
     <w:p>
       <w:pPr>
@@ -503,21 +575,7 @@
         <w:rPr>
           <w:strike/>
         </w:rPr>
-        <w:t xml:space="preserve">-&gt; do not </w:t>
-      </w:r>
-      <w:proofErr w:type="gramStart"/>
-      <w:r>
-        <w:rPr>
-          <w:strike/>
-        </w:rPr>
-        <w:t>have not</w:t>
-      </w:r>
-      <w:proofErr w:type="gramEnd"/>
-      <w:r>
-        <w:rPr>
-          <w:strike/>
-        </w:rPr>
-        <w:t xml:space="preserve"> applicable as 0</w:t>
+        <w:t>-&gt; do not have not applicable as 0</w:t>
       </w:r>
     </w:p>
     <w:p>
@@ -529,15 +587,7 @@
         </w:numPr>
       </w:pPr>
       <w:r>
-        <w:t>For every question, include a side-option as “</w:t>
-      </w:r>
-      <w:proofErr w:type="spellStart"/>
-      <w:r>
-        <w:t>Don’t’know</w:t>
-      </w:r>
-      <w:proofErr w:type="spellEnd"/>
-      <w:r>
-        <w:t>/Not applicable”</w:t>
+        <w:t>For every question, include a side-option as “Don’t’know/Not applicable”</w:t>
       </w:r>
     </w:p>
     <w:p>
@@ -564,13 +614,8 @@
         <w:t xml:space="preserve">Not allowing me to click </w:t>
       </w:r>
       <w:r>
-        <w:t xml:space="preserve">any of the </w:t>
-      </w:r>
-      <w:proofErr w:type="gramStart"/>
-      <w:r>
-        <w:t>multiple choice</w:t>
-      </w:r>
-      <w:proofErr w:type="gramEnd"/>
+        <w:t>any of the multiple choice</w:t>
+      </w:r>
       <w:r>
         <w:t xml:space="preserve"> question</w:t>
       </w:r>
@@ -596,35 +641,7 @@
         <w:rPr>
           <w:strike/>
         </w:rPr>
-        <w:t xml:space="preserve">11 </w:t>
-      </w:r>
-      <w:proofErr w:type="gramStart"/>
-      <w:r>
-        <w:rPr>
-          <w:strike/>
-        </w:rPr>
-        <w:t>review</w:t>
-      </w:r>
-      <w:proofErr w:type="gramEnd"/>
-      <w:r>
-        <w:rPr>
-          <w:strike/>
-        </w:rPr>
-        <w:t xml:space="preserve"> and </w:t>
-      </w:r>
-      <w:proofErr w:type="gramStart"/>
-      <w:r>
-        <w:rPr>
-          <w:strike/>
-        </w:rPr>
-        <w:t>submit</w:t>
-      </w:r>
-      <w:proofErr w:type="gramEnd"/>
-      <w:r>
-        <w:rPr>
-          <w:strike/>
-        </w:rPr>
-        <w:t>:</w:t>
+        <w:t>11 review and submit:</w:t>
       </w:r>
     </w:p>
     <w:p>
@@ -642,7 +659,6 @@
         <w:rPr>
           <w:strike/>
         </w:rPr>
-        <w:lastRenderedPageBreak/>
         <w:t>Do not show summary like that, leave it open for now</w:t>
       </w:r>
     </w:p>
@@ -691,21 +707,7 @@
         <w:rPr>
           <w:strike/>
         </w:rPr>
-        <w:t xml:space="preserve">For “removed from waitlist question”. Phrase it differently like “did you get </w:t>
-      </w:r>
-      <w:proofErr w:type="gramStart"/>
-      <w:r>
-        <w:rPr>
-          <w:strike/>
-        </w:rPr>
-        <w:t>off of</w:t>
-      </w:r>
-      <w:proofErr w:type="gramEnd"/>
-      <w:r>
-        <w:rPr>
-          <w:strike/>
-        </w:rPr>
-        <w:t xml:space="preserve"> any waitlists, as in, got a spot in a </w:t>
+        <w:t xml:space="preserve">For “removed from waitlist question”. Phrase it differently like “did you get off of any waitlists, as in, got a spot in a </w:t>
       </w:r>
       <w:r>
         <w:rPr>
@@ -813,21 +815,7 @@
         <w:rPr>
           <w:strike/>
         </w:rPr>
-        <w:t xml:space="preserve">I edited the file structure, now there is </w:t>
-      </w:r>
-      <w:proofErr w:type="gramStart"/>
-      <w:r>
-        <w:rPr>
-          <w:strike/>
-        </w:rPr>
-        <w:t>not</w:t>
-      </w:r>
-      <w:proofErr w:type="gramEnd"/>
-      <w:r>
-        <w:rPr>
-          <w:strike/>
-        </w:rPr>
-        <w:t xml:space="preserve"> parent folder anymore, it is just the childcare-precarity-tool folder. </w:t>
+        <w:t xml:space="preserve">I edited the file structure, now there is not parent folder anymore, it is just the childcare-precarity-tool folder. </w:t>
       </w:r>
     </w:p>
     <w:p>
@@ -845,21 +833,7 @@
         <w:rPr>
           <w:strike/>
         </w:rPr>
-        <w:t xml:space="preserve">I excluded some files and moved some to a folder called archive. Please have </w:t>
-      </w:r>
-      <w:proofErr w:type="spellStart"/>
-      <w:r>
-        <w:rPr>
-          <w:strike/>
-        </w:rPr>
-        <w:t>github</w:t>
-      </w:r>
-      <w:proofErr w:type="spellEnd"/>
-      <w:r>
-        <w:rPr>
-          <w:strike/>
-        </w:rPr>
-        <w:t xml:space="preserve"> ignore and not </w:t>
+        <w:t xml:space="preserve">I excluded some files and moved some to a folder called archive. Please have github ignore and not </w:t>
       </w:r>
       <w:r>
         <w:rPr>
@@ -922,6 +896,7 @@
           <w:b/>
           <w:bCs/>
         </w:rPr>
+        <w:lastRenderedPageBreak/>
         <w:t>Entry and exit</w:t>
       </w:r>
       <w:r>
@@ -1150,7 +1125,6 @@
         </w:numPr>
       </w:pPr>
       <w:r>
-        <w:lastRenderedPageBreak/>
         <w:t>Subsidy?</w:t>
       </w:r>
     </w:p>
@@ -1265,13 +1239,8 @@
         <w:t xml:space="preserve">? </w:t>
       </w:r>
       <w:r>
-        <w:t xml:space="preserve">Provider has </w:t>
-      </w:r>
-      <w:proofErr w:type="gramStart"/>
-      <w:r>
-        <w:t>degree?</w:t>
-      </w:r>
-      <w:proofErr w:type="gramEnd"/>
+        <w:t>Provider has degree?</w:t>
+      </w:r>
     </w:p>
     <w:p>
       <w:pPr>
@@ -1320,13 +1289,8 @@
           <w:numId w:val="3"/>
         </w:numPr>
       </w:pPr>
-      <w:proofErr w:type="gramStart"/>
-      <w:r>
-        <w:t>Meet</w:t>
-      </w:r>
-      <w:proofErr w:type="gramEnd"/>
-      <w:r>
-        <w:t xml:space="preserve"> parents’ needs</w:t>
+      <w:r>
+        <w:t>Meet parents’ needs</w:t>
       </w:r>
     </w:p>
     <w:p>
@@ -1482,6 +1446,7 @@
         </w:numPr>
       </w:pPr>
       <w:r>
+        <w:lastRenderedPageBreak/>
         <w:t>Race/ethnicity</w:t>
       </w:r>
     </w:p>
@@ -1564,7 +1529,6 @@
         <w:rPr>
           <w:noProof/>
         </w:rPr>
-        <w:lastRenderedPageBreak/>
         <w:drawing>
           <wp:inline distT="0" distB="0" distL="0" distR="0" wp14:anchorId="6D8414E2" wp14:editId="68B1D156">
             <wp:extent cx="5614988" cy="2009638"/>
@@ -1799,11 +1763,9 @@
           <w:tab w:val="left" w:pos="7898"/>
         </w:tabs>
       </w:pPr>
-      <w:proofErr w:type="spellStart"/>
       <w:r>
         <w:t>Etc</w:t>
       </w:r>
-      <w:proofErr w:type="spellEnd"/>
     </w:p>
     <w:p>
       <w:pPr>
@@ -1832,15 +1794,7 @@
         </w:tabs>
       </w:pPr>
       <w:r>
-        <w:t xml:space="preserve">Parents: precarity (instability + </w:t>
-      </w:r>
-      <w:proofErr w:type="spellStart"/>
-      <w:r>
-        <w:t>smth</w:t>
-      </w:r>
-      <w:proofErr w:type="spellEnd"/>
-      <w:r>
-        <w:t>), work-status, stress, cognition?</w:t>
+        <w:t>Parents: precarity (instability + smth), work-status, stress, cognition?</w:t>
       </w:r>
     </w:p>
     <w:p>
@@ -1870,6 +1824,7 @@
         </w:tabs>
       </w:pPr>
       <w:r>
+        <w:lastRenderedPageBreak/>
         <w:t xml:space="preserve">Kids: once at study entry, once </w:t>
       </w:r>
       <w:r>
@@ -1888,15 +1843,7 @@
         </w:tabs>
       </w:pPr>
       <w:r>
-        <w:t xml:space="preserve">Think about design carefully: how much time, when to measure, how long </w:t>
-      </w:r>
-      <w:proofErr w:type="gramStart"/>
-      <w:r>
-        <w:t>should the study</w:t>
-      </w:r>
-      <w:proofErr w:type="gramEnd"/>
-      <w:r>
-        <w:t xml:space="preserve"> be, etc. </w:t>
+        <w:t xml:space="preserve">Think about design carefully: how much time, when to measure, how long should the study be, etc. </w:t>
       </w:r>
     </w:p>
     <w:p>
@@ -1940,13 +1887,8 @@
         <w:t xml:space="preserve">Phil said to go community based, </w:t>
       </w:r>
       <w:r>
-        <w:t xml:space="preserve">make it useful, </w:t>
-      </w:r>
-      <w:proofErr w:type="spellStart"/>
-      <w:r>
-        <w:t>blablabla</w:t>
-      </w:r>
-      <w:proofErr w:type="spellEnd"/>
+        <w:t>make it useful, blablabla</w:t>
+      </w:r>
     </w:p>
     <w:p>
       <w:pPr>
@@ -1979,7 +1921,6 @@
         </w:tabs>
       </w:pPr>
       <w:r>
-        <w:lastRenderedPageBreak/>
         <w:t>We ask them to plan at the beginning of each week, they can use to orient themselves, just like a regular calendar</w:t>
       </w:r>
     </w:p>
@@ -2490,6 +2431,119 @@
     </w:lvl>
   </w:abstractNum>
   <w:abstractNum w:abstractNumId="3" w15:restartNumberingAfterBreak="0">
+    <w:nsid w:val="440E073A"/>
+    <w:multiLevelType w:val="hybridMultilevel"/>
+    <w:tmpl w:val="C4C43F04"/>
+    <w:lvl w:ilvl="0" w:tplc="04090001">
+      <w:start w:val="1"/>
+      <w:numFmt w:val="bullet"/>
+      <w:lvlText w:val=""/>
+      <w:lvlJc w:val="left"/>
+      <w:pPr>
+        <w:ind w:left="720" w:hanging="360"/>
+      </w:pPr>
+      <w:rPr>
+        <w:rFonts w:ascii="Symbol" w:hAnsi="Symbol" w:hint="default"/>
+      </w:rPr>
+    </w:lvl>
+    <w:lvl w:ilvl="1" w:tplc="04090003">
+      <w:start w:val="1"/>
+      <w:numFmt w:val="bullet"/>
+      <w:lvlText w:val="o"/>
+      <w:lvlJc w:val="left"/>
+      <w:pPr>
+        <w:ind w:left="1440" w:hanging="360"/>
+      </w:pPr>
+      <w:rPr>
+        <w:rFonts w:ascii="Courier New" w:hAnsi="Courier New" w:cs="Courier New" w:hint="default"/>
+      </w:rPr>
+    </w:lvl>
+    <w:lvl w:ilvl="2" w:tplc="04090005">
+      <w:start w:val="1"/>
+      <w:numFmt w:val="bullet"/>
+      <w:lvlText w:val=""/>
+      <w:lvlJc w:val="left"/>
+      <w:pPr>
+        <w:ind w:left="2160" w:hanging="360"/>
+      </w:pPr>
+      <w:rPr>
+        <w:rFonts w:ascii="Wingdings" w:hAnsi="Wingdings" w:hint="default"/>
+      </w:rPr>
+    </w:lvl>
+    <w:lvl w:ilvl="3" w:tplc="04090001" w:tentative="1">
+      <w:start w:val="1"/>
+      <w:numFmt w:val="bullet"/>
+      <w:lvlText w:val=""/>
+      <w:lvlJc w:val="left"/>
+      <w:pPr>
+        <w:ind w:left="2880" w:hanging="360"/>
+      </w:pPr>
+      <w:rPr>
+        <w:rFonts w:ascii="Symbol" w:hAnsi="Symbol" w:hint="default"/>
+      </w:rPr>
+    </w:lvl>
+    <w:lvl w:ilvl="4" w:tplc="04090003" w:tentative="1">
+      <w:start w:val="1"/>
+      <w:numFmt w:val="bullet"/>
+      <w:lvlText w:val="o"/>
+      <w:lvlJc w:val="left"/>
+      <w:pPr>
+        <w:ind w:left="3600" w:hanging="360"/>
+      </w:pPr>
+      <w:rPr>
+        <w:rFonts w:ascii="Courier New" w:hAnsi="Courier New" w:cs="Courier New" w:hint="default"/>
+      </w:rPr>
+    </w:lvl>
+    <w:lvl w:ilvl="5" w:tplc="04090005" w:tentative="1">
+      <w:start w:val="1"/>
+      <w:numFmt w:val="bullet"/>
+      <w:lvlText w:val=""/>
+      <w:lvlJc w:val="left"/>
+      <w:pPr>
+        <w:ind w:left="4320" w:hanging="360"/>
+      </w:pPr>
+      <w:rPr>
+        <w:rFonts w:ascii="Wingdings" w:hAnsi="Wingdings" w:hint="default"/>
+      </w:rPr>
+    </w:lvl>
+    <w:lvl w:ilvl="6" w:tplc="04090001" w:tentative="1">
+      <w:start w:val="1"/>
+      <w:numFmt w:val="bullet"/>
+      <w:lvlText w:val=""/>
+      <w:lvlJc w:val="left"/>
+      <w:pPr>
+        <w:ind w:left="5040" w:hanging="360"/>
+      </w:pPr>
+      <w:rPr>
+        <w:rFonts w:ascii="Symbol" w:hAnsi="Symbol" w:hint="default"/>
+      </w:rPr>
+    </w:lvl>
+    <w:lvl w:ilvl="7" w:tplc="04090003" w:tentative="1">
+      <w:start w:val="1"/>
+      <w:numFmt w:val="bullet"/>
+      <w:lvlText w:val="o"/>
+      <w:lvlJc w:val="left"/>
+      <w:pPr>
+        <w:ind w:left="5760" w:hanging="360"/>
+      </w:pPr>
+      <w:rPr>
+        <w:rFonts w:ascii="Courier New" w:hAnsi="Courier New" w:cs="Courier New" w:hint="default"/>
+      </w:rPr>
+    </w:lvl>
+    <w:lvl w:ilvl="8" w:tplc="04090005" w:tentative="1">
+      <w:start w:val="1"/>
+      <w:numFmt w:val="bullet"/>
+      <w:lvlText w:val=""/>
+      <w:lvlJc w:val="left"/>
+      <w:pPr>
+        <w:ind w:left="6480" w:hanging="360"/>
+      </w:pPr>
+      <w:rPr>
+        <w:rFonts w:ascii="Wingdings" w:hAnsi="Wingdings" w:hint="default"/>
+      </w:rPr>
+    </w:lvl>
+  </w:abstractNum>
+  <w:abstractNum w:abstractNumId="4" w15:restartNumberingAfterBreak="0">
     <w:nsid w:val="453A0D2D"/>
     <w:multiLevelType w:val="hybridMultilevel"/>
     <w:tmpl w:val="57F4930A"/>
@@ -2602,7 +2656,7 @@
       </w:rPr>
     </w:lvl>
   </w:abstractNum>
-  <w:abstractNum w:abstractNumId="4" w15:restartNumberingAfterBreak="0">
+  <w:abstractNum w:abstractNumId="5" w15:restartNumberingAfterBreak="0">
     <w:nsid w:val="69C87589"/>
     <w:multiLevelType w:val="hybridMultilevel"/>
     <w:tmpl w:val="D20EEE36"/>
@@ -2725,9 +2779,12 @@
     <w:abstractNumId w:val="2"/>
   </w:num>
   <w:num w:numId="4" w16cid:durableId="396711410">
+    <w:abstractNumId w:val="5"/>
+  </w:num>
+  <w:num w:numId="5" w16cid:durableId="54668405">
     <w:abstractNumId w:val="4"/>
   </w:num>
-  <w:num w:numId="5" w16cid:durableId="54668405">
+  <w:num w:numId="6" w16cid:durableId="1629512001">
     <w:abstractNumId w:val="3"/>
   </w:num>
 </w:numbering>

</xml_diff>